<commit_message>
Auto Daily 8:00 PM Dashboard Update [2026-10-13 20:00]
</commit_message>
<xml_diff>
--- a/docs/weekly/2026-W42_當週執行率回顧報告.docx
+++ b/docs/weekly/2026-W42_當週執行率回顧報告.docx
@@ -21,7 +21,7 @@
           <w:color w:val="555555"/>
           <w:sz w:val="20"/>
         </w:rPr>
-        <w:t>週期：2026/10/12–2026/10/18　｜　整體時間執行率：0.0%</w:t>
+        <w:t>週期：2026/10/12–2026/10/18　｜　整體時間執行率：13.0%</w:t>
       </w:r>
     </w:p>
     <w:p>
@@ -565,7 +565,7 @@
                 <w:color w:val="000000"/>
                 <w:sz w:val="19"/>
               </w:rPr>
-              <w:t>0.00 hr</w:t>
+              <w:t>0.67 hr</w:t>
             </w:r>
           </w:p>
         </w:tc>
@@ -592,7 +592,7 @@
                 <w:color w:val="000000"/>
                 <w:sz w:val="19"/>
               </w:rPr>
-              <w:t>0.0%</w:t>
+              <w:t>9.4%</w:t>
             </w:r>
           </w:p>
         </w:tc>
@@ -646,7 +646,7 @@
                 <w:color w:val="000000"/>
                 <w:sz w:val="19"/>
               </w:rPr>
-              <w:t>0.00 km</w:t>
+              <w:t>18.97 km</w:t>
             </w:r>
           </w:p>
         </w:tc>
@@ -673,7 +673,7 @@
                 <w:color w:val="000000"/>
                 <w:sz w:val="19"/>
               </w:rPr>
-              <w:t>0.0%</w:t>
+              <w:t>16.1%</w:t>
             </w:r>
           </w:p>
         </w:tc>
@@ -783,7 +783,7 @@
                 <w:color w:val="000000"/>
                 <w:sz w:val="19"/>
               </w:rPr>
-              <w:t>0.00 hr</w:t>
+              <w:t>1.27 hr</w:t>
             </w:r>
           </w:p>
         </w:tc>
@@ -810,7 +810,7 @@
                 <w:color w:val="000000"/>
                 <w:sz w:val="19"/>
               </w:rPr>
-              <w:t>0.0%</w:t>
+              <w:t>27.6%</w:t>
             </w:r>
           </w:p>
         </w:tc>
@@ -864,7 +864,7 @@
                 <w:color w:val="000000"/>
                 <w:sz w:val="19"/>
               </w:rPr>
-              <w:t>0.00 km</w:t>
+              <w:t>12.93 km</w:t>
             </w:r>
           </w:p>
         </w:tc>
@@ -891,7 +891,7 @@
                 <w:color w:val="000000"/>
                 <w:sz w:val="19"/>
               </w:rPr>
-              <w:t>0.0%</w:t>
+              <w:t>27.7%</w:t>
             </w:r>
           </w:p>
         </w:tc>
@@ -1631,7 +1631,7 @@
                 <w:color w:val="000000"/>
                 <w:sz w:val="19"/>
               </w:rPr>
-              <w:t>0分</w:t>
+              <w:t>40分 / 18.97km</w:t>
             </w:r>
           </w:p>
         </w:tc>
@@ -1658,7 +1658,7 @@
                 <w:color w:val="000000"/>
                 <w:sz w:val="19"/>
               </w:rPr>
-              <w:t>❌ 未執行/待排程</w:t>
+              <w:t>✅ 精準達標 (100%, A+)</w:t>
             </w:r>
           </w:p>
         </w:tc>
@@ -1797,7 +1797,7 @@
                 <w:color w:val="000000"/>
                 <w:sz w:val="19"/>
               </w:rPr>
-              <w:t>0分</w:t>
+              <w:t>76分 / 12.93km</w:t>
             </w:r>
           </w:p>
         </w:tc>
@@ -1824,7 +1824,7 @@
                 <w:color w:val="000000"/>
                 <w:sz w:val="19"/>
               </w:rPr>
-              <w:t>❌ 未執行/待排程</w:t>
+              <w:t>✅ 精準達標 (95%, A+)</w:t>
             </w:r>
           </w:p>
         </w:tc>
@@ -3345,7 +3345,7 @@
     </w:p>
     <w:p>
       <w:r>
-        <w:t>• 當週累積自行車 0.00 km、跑步 0.00 km、游泳 0.00 km，整體時間執行率達 0.0%。</w:t>
+        <w:t>• 當週累積自行車 18.97 km、跑步 12.93 km、游泳 0.00 km，整體時間執行率達 13.0%。</w:t>
         <w:br/>
       </w:r>
       <w:r>

</xml_diff>

<commit_message>
Auto Daily 8:00 PM Dashboard Update [2026-10-14 21:00]
</commit_message>
<xml_diff>
--- a/docs/weekly/2026-W42_當週執行率回顧報告.docx
+++ b/docs/weekly/2026-W42_當週執行率回顧報告.docx
@@ -21,7 +21,7 @@
           <w:color w:val="555555"/>
           <w:sz w:val="20"/>
         </w:rPr>
-        <w:t>週期：2026/10/12–2026/10/18　｜　整體時間執行率：13.0%</w:t>
+        <w:t>週期：2026/10/12–2026/10/18　｜　整體時間執行率：25.1%</w:t>
       </w:r>
     </w:p>
     <w:p>
@@ -347,7 +347,7 @@
                 <w:color w:val="000000"/>
                 <w:sz w:val="19"/>
               </w:rPr>
-              <w:t>0.00 hr</w:t>
+              <w:t>1.07 hr</w:t>
             </w:r>
           </w:p>
         </w:tc>
@@ -374,7 +374,7 @@
                 <w:color w:val="000000"/>
                 <w:sz w:val="19"/>
               </w:rPr>
-              <w:t>0.0%</w:t>
+              <w:t>32.8%</w:t>
             </w:r>
           </w:p>
         </w:tc>
@@ -428,7 +428,7 @@
                 <w:color w:val="000000"/>
                 <w:sz w:val="19"/>
               </w:rPr>
-              <w:t>0.00 km</w:t>
+              <w:t>3.20 km</w:t>
             </w:r>
           </w:p>
         </w:tc>
@@ -455,7 +455,7 @@
                 <w:color w:val="000000"/>
                 <w:sz w:val="19"/>
               </w:rPr>
-              <w:t>0.0%</w:t>
+              <w:t>139.1%</w:t>
             </w:r>
           </w:p>
         </w:tc>
@@ -565,7 +565,7 @@
                 <w:color w:val="000000"/>
                 <w:sz w:val="19"/>
               </w:rPr>
-              <w:t>0.67 hr</w:t>
+              <w:t>1.42 hr</w:t>
             </w:r>
           </w:p>
         </w:tc>
@@ -592,7 +592,7 @@
                 <w:color w:val="000000"/>
                 <w:sz w:val="19"/>
               </w:rPr>
-              <w:t>9.4%</w:t>
+              <w:t>20.0%</w:t>
             </w:r>
           </w:p>
         </w:tc>
@@ -646,7 +646,7 @@
                 <w:color w:val="000000"/>
                 <w:sz w:val="19"/>
               </w:rPr>
-              <w:t>18.97 km</w:t>
+              <w:t>36.16 km</w:t>
             </w:r>
           </w:p>
         </w:tc>
@@ -673,7 +673,7 @@
                 <w:color w:val="000000"/>
                 <w:sz w:val="19"/>
               </w:rPr>
-              <w:t>16.1%</w:t>
+              <w:t>30.6%</w:t>
             </w:r>
           </w:p>
         </w:tc>
@@ -1963,7 +1963,7 @@
                 <w:color w:val="000000"/>
                 <w:sz w:val="19"/>
               </w:rPr>
-              <w:t>0分</w:t>
+              <w:t>45分 / 17.19km</w:t>
             </w:r>
           </w:p>
         </w:tc>
@@ -1990,7 +1990,7 @@
                 <w:color w:val="000000"/>
                 <w:sz w:val="19"/>
               </w:rPr>
-              <w:t>❌ 未執行/待排程</w:t>
+              <w:t>✅ 精準達標 (100%, A+)</w:t>
             </w:r>
           </w:p>
         </w:tc>
@@ -2129,7 +2129,7 @@
                 <w:color w:val="000000"/>
                 <w:sz w:val="19"/>
               </w:rPr>
-              <w:t>0分</w:t>
+              <w:t>64分 / 3.20km</w:t>
             </w:r>
           </w:p>
         </w:tc>
@@ -2156,7 +2156,7 @@
                 <w:color w:val="000000"/>
                 <w:sz w:val="19"/>
               </w:rPr>
-              <w:t>❌ 未執行/待排程</w:t>
+              <w:t>🟢 良好達標 (85%, A-)</w:t>
             </w:r>
           </w:p>
         </w:tc>
@@ -3345,7 +3345,7 @@
     </w:p>
     <w:p>
       <w:r>
-        <w:t>• 當週累積自行車 18.97 km、跑步 12.93 km、游泳 0.00 km，整體時間執行率達 13.0%。</w:t>
+        <w:t>• 當週累積自行車 36.16 km、跑步 12.93 km、游泳 3.20 km，整體時間執行率達 25.1%。</w:t>
         <w:br/>
       </w:r>
       <w:r>

</xml_diff>

<commit_message>
Auto Daily 8:00 PM Dashboard Update [2026-10-15 20:00]
</commit_message>
<xml_diff>
--- a/docs/weekly/2026-W42_當週執行率回顧報告.docx
+++ b/docs/weekly/2026-W42_當週執行率回顧報告.docx
@@ -21,7 +21,7 @@
           <w:color w:val="555555"/>
           <w:sz w:val="20"/>
         </w:rPr>
-        <w:t>週期：2026/10/12–2026/10/18　｜　整體時間執行率：25.1%</w:t>
+        <w:t>週期：2026/10/12–2026/10/18　｜　整體時間執行率：39.9%</w:t>
       </w:r>
     </w:p>
     <w:p>
@@ -565,7 +565,7 @@
                 <w:color w:val="000000"/>
                 <w:sz w:val="19"/>
               </w:rPr>
-              <w:t>1.42 hr</w:t>
+              <w:t>3.08 hr</w:t>
             </w:r>
           </w:p>
         </w:tc>
@@ -592,7 +592,7 @@
                 <w:color w:val="000000"/>
                 <w:sz w:val="19"/>
               </w:rPr>
-              <w:t>20.0%</w:t>
+              <w:t>43.5%</w:t>
             </w:r>
           </w:p>
         </w:tc>
@@ -646,7 +646,7 @@
                 <w:color w:val="000000"/>
                 <w:sz w:val="19"/>
               </w:rPr>
-              <w:t>36.16 km</w:t>
+              <w:t>87.39 km</w:t>
             </w:r>
           </w:p>
         </w:tc>
@@ -673,7 +673,7 @@
                 <w:color w:val="000000"/>
                 <w:sz w:val="19"/>
               </w:rPr>
-              <w:t>30.6%</w:t>
+              <w:t>74.1%</w:t>
             </w:r>
           </w:p>
         </w:tc>
@@ -783,7 +783,7 @@
                 <w:color w:val="000000"/>
                 <w:sz w:val="19"/>
               </w:rPr>
-              <w:t>1.27 hr</w:t>
+              <w:t>1.80 hr</w:t>
             </w:r>
           </w:p>
         </w:tc>
@@ -810,7 +810,7 @@
                 <w:color w:val="000000"/>
                 <w:sz w:val="19"/>
               </w:rPr>
-              <w:t>27.6%</w:t>
+              <w:t>39.3%</w:t>
             </w:r>
           </w:p>
         </w:tc>
@@ -864,7 +864,7 @@
                 <w:color w:val="000000"/>
                 <w:sz w:val="19"/>
               </w:rPr>
-              <w:t>12.93 km</w:t>
+              <w:t>18.66 km</w:t>
             </w:r>
           </w:p>
         </w:tc>
@@ -891,7 +891,7 @@
                 <w:color w:val="000000"/>
                 <w:sz w:val="19"/>
               </w:rPr>
-              <w:t>27.7%</w:t>
+              <w:t>40.0%</w:t>
             </w:r>
           </w:p>
         </w:tc>
@@ -2295,7 +2295,7 @@
                 <w:color w:val="000000"/>
                 <w:sz w:val="19"/>
               </w:rPr>
-              <w:t>0分</w:t>
+              <w:t>100分 / 51.23km</w:t>
             </w:r>
           </w:p>
         </w:tc>
@@ -2322,7 +2322,7 @@
                 <w:color w:val="000000"/>
                 <w:sz w:val="19"/>
               </w:rPr>
-              <w:t>❌ 未執行/待排程</w:t>
+              <w:t>✅ 精準達標 (100%, A+)</w:t>
             </w:r>
           </w:p>
         </w:tc>
@@ -2461,7 +2461,7 @@
                 <w:color w:val="000000"/>
                 <w:sz w:val="19"/>
               </w:rPr>
-              <w:t>0分</w:t>
+              <w:t>32分 / 5.73km</w:t>
             </w:r>
           </w:p>
         </w:tc>
@@ -2488,7 +2488,7 @@
                 <w:color w:val="000000"/>
                 <w:sz w:val="19"/>
               </w:rPr>
-              <w:t>❌ 未執行/待排程</w:t>
+              <w:t>⚡ 超額完成 (107%, A)</w:t>
             </w:r>
           </w:p>
         </w:tc>
@@ -3345,7 +3345,7 @@
     </w:p>
     <w:p>
       <w:r>
-        <w:t>• 當週累積自行車 36.16 km、跑步 12.93 km、游泳 3.20 km，整體時間執行率達 25.1%。</w:t>
+        <w:t>• 當週累積自行車 87.39 km、跑步 18.66 km、游泳 3.20 km，整體時間執行率達 39.9%。</w:t>
         <w:br/>
       </w:r>
       <w:r>

</xml_diff>

<commit_message>
Auto Daily 8:00 PM Dashboard Update [2026-10-16 20:48]
</commit_message>
<xml_diff>
--- a/docs/weekly/2026-W42_當週執行率回顧報告.docx
+++ b/docs/weekly/2026-W42_當週執行率回顧報告.docx
@@ -21,7 +21,7 @@
           <w:color w:val="555555"/>
           <w:sz w:val="20"/>
         </w:rPr>
-        <w:t>週期：2026/10/12–2026/10/18　｜　整體時間執行率：39.9%</w:t>
+        <w:t>週期：2026/10/12–2026/10/18　｜　整體時間執行率：46.8%</w:t>
       </w:r>
     </w:p>
     <w:p>
@@ -347,7 +347,7 @@
                 <w:color w:val="000000"/>
                 <w:sz w:val="19"/>
               </w:rPr>
-              <w:t>1.07 hr</w:t>
+              <w:t>2.10 hr</w:t>
             </w:r>
           </w:p>
         </w:tc>
@@ -374,7 +374,7 @@
                 <w:color w:val="000000"/>
                 <w:sz w:val="19"/>
               </w:rPr>
-              <w:t>32.8%</w:t>
+              <w:t>64.6%</w:t>
             </w:r>
           </w:p>
         </w:tc>
@@ -428,7 +428,7 @@
                 <w:color w:val="000000"/>
                 <w:sz w:val="19"/>
               </w:rPr>
-              <w:t>3.20 km</w:t>
+              <w:t>6.50 km</w:t>
             </w:r>
           </w:p>
         </w:tc>
@@ -455,7 +455,7 @@
                 <w:color w:val="000000"/>
                 <w:sz w:val="19"/>
               </w:rPr>
-              <w:t>139.1%</w:t>
+              <w:t>282.6%</w:t>
             </w:r>
           </w:p>
         </w:tc>
@@ -2627,7 +2627,7 @@
                 <w:color w:val="000000"/>
                 <w:sz w:val="19"/>
               </w:rPr>
-              <w:t>0分</w:t>
+              <w:t>62分 / 3.30km</w:t>
             </w:r>
           </w:p>
         </w:tc>
@@ -2654,7 +2654,7 @@
                 <w:color w:val="000000"/>
                 <w:sz w:val="19"/>
               </w:rPr>
-              <w:t>❌ 未執行/待排程</w:t>
+              <w:t>🟢 良好達標 (83%, A-)</w:t>
             </w:r>
           </w:p>
         </w:tc>
@@ -3345,7 +3345,7 @@
     </w:p>
     <w:p>
       <w:r>
-        <w:t>• 當週累積自行車 87.39 km、跑步 18.66 km、游泳 3.20 km，整體時間執行率達 39.9%。</w:t>
+        <w:t>• 當週累積自行車 87.39 km、跑步 18.66 km、游泳 6.50 km，整體時間執行率達 46.8%。</w:t>
         <w:br/>
       </w:r>
       <w:r>

</xml_diff>

<commit_message>
Auto Daily 8:00 PM Dashboard Update [2026-10-18 03:05]
</commit_message>
<xml_diff>
--- a/docs/weekly/2026-W42_當週執行率回顧報告.docx
+++ b/docs/weekly/2026-W42_當週執行率回顧報告.docx
@@ -21,7 +21,7 @@
           <w:color w:val="555555"/>
           <w:sz w:val="20"/>
         </w:rPr>
-        <w:t>週期：2026/10/12–2026/10/18　｜　整體時間執行率：46.8%</w:t>
+        <w:t>週期：2026/10/12–2026/10/18　｜　整體時間執行率：82.1%</w:t>
       </w:r>
     </w:p>
     <w:p>
@@ -565,7 +565,7 @@
                 <w:color w:val="000000"/>
                 <w:sz w:val="19"/>
               </w:rPr>
-              <w:t>3.08 hr</w:t>
+              <w:t>6.85 hr</w:t>
             </w:r>
           </w:p>
         </w:tc>
@@ -592,7 +592,7 @@
                 <w:color w:val="000000"/>
                 <w:sz w:val="19"/>
               </w:rPr>
-              <w:t>43.5%</w:t>
+              <w:t>96.7%</w:t>
             </w:r>
           </w:p>
         </w:tc>
@@ -646,7 +646,7 @@
                 <w:color w:val="000000"/>
                 <w:sz w:val="19"/>
               </w:rPr>
-              <w:t>87.39 km</w:t>
+              <w:t>190.50 km</w:t>
             </w:r>
           </w:p>
         </w:tc>
@@ -673,7 +673,7 @@
                 <w:color w:val="000000"/>
                 <w:sz w:val="19"/>
               </w:rPr>
-              <w:t>74.1%</w:t>
+              <w:t>161.4%</w:t>
             </w:r>
           </w:p>
         </w:tc>
@@ -783,7 +783,7 @@
                 <w:color w:val="000000"/>
                 <w:sz w:val="19"/>
               </w:rPr>
-              <w:t>1.80 hr</w:t>
+              <w:t>3.30 hr</w:t>
             </w:r>
           </w:p>
         </w:tc>
@@ -810,7 +810,7 @@
                 <w:color w:val="000000"/>
                 <w:sz w:val="19"/>
               </w:rPr>
-              <w:t>39.3%</w:t>
+              <w:t>72.0%</w:t>
             </w:r>
           </w:p>
         </w:tc>
@@ -864,7 +864,7 @@
                 <w:color w:val="000000"/>
                 <w:sz w:val="19"/>
               </w:rPr>
-              <w:t>18.66 km</w:t>
+              <w:t>30.65 km</w:t>
             </w:r>
           </w:p>
         </w:tc>
@@ -891,7 +891,7 @@
                 <w:color w:val="000000"/>
                 <w:sz w:val="19"/>
               </w:rPr>
-              <w:t>40.0%</w:t>
+              <w:t>65.6%</w:t>
             </w:r>
           </w:p>
         </w:tc>
@@ -2793,7 +2793,7 @@
                 <w:color w:val="000000"/>
                 <w:sz w:val="19"/>
               </w:rPr>
-              <w:t>0分</w:t>
+              <w:t>226分 / 103.11km</w:t>
             </w:r>
           </w:p>
         </w:tc>
@@ -2820,7 +2820,7 @@
                 <w:color w:val="000000"/>
                 <w:sz w:val="19"/>
               </w:rPr>
-              <w:t>❌ 未執行/待排程</w:t>
+              <w:t>🟢 良好達標 (94%, A-)</w:t>
             </w:r>
           </w:p>
         </w:tc>
@@ -2959,7 +2959,7 @@
                 <w:color w:val="000000"/>
                 <w:sz w:val="19"/>
               </w:rPr>
-              <w:t>0分</w:t>
+              <w:t>90分 / 11.99km</w:t>
             </w:r>
           </w:p>
         </w:tc>
@@ -2986,7 +2986,7 @@
                 <w:color w:val="000000"/>
                 <w:sz w:val="19"/>
               </w:rPr>
-              <w:t>❌ 未執行/待排程</w:t>
+              <w:t>⚡ 超額完成 (120%, A)</w:t>
             </w:r>
           </w:p>
         </w:tc>
@@ -3345,7 +3345,15 @@
     </w:p>
     <w:p>
       <w:r>
-        <w:t>• 當週累積自行車 87.39 km、跑步 18.66 km、游泳 6.50 km，整體時間執行率達 46.8%。</w:t>
+        <w:t>• 當週累積自行車 190.50 km、跑步 30.65 km、游泳 6.50 km，整體時間執行率達 82.1%。</w:t>
+        <w:br/>
+      </w:r>
+      <w:r>
+        <w:t>• 長距離單車扎實完成，左右踩踏發力極為平衡 (50.5% / 49.5%)，座艙穩定度高。</w:t>
+        <w:br/>
+      </w:r>
+      <w:r>
+        <w:t>• 順利完成 17.52 km 長跑（總爬升 +327m），平路河濱漸速至 5:26/km，上坡穩健控心率並自覺補水折返，下坡迅速拉高步頻收尾。</w:t>
         <w:br/>
       </w:r>
       <w:r>

</xml_diff>

<commit_message>
Auto Daily 8:00 PM Dashboard Update [2026-10-18 20:00]
</commit_message>
<xml_diff>
--- a/docs/weekly/2026-W42_當週執行率回顧報告.docx
+++ b/docs/weekly/2026-W42_當週執行率回顧報告.docx
@@ -21,7 +21,7 @@
           <w:color w:val="555555"/>
           <w:sz w:val="20"/>
         </w:rPr>
-        <w:t>週期：2026/10/12–2026/10/18　｜　整體時間執行率：82.1%</w:t>
+        <w:t>週期：2026/10/12–2026/10/18　｜　整體時間執行率：96.5%</w:t>
       </w:r>
     </w:p>
     <w:p>
@@ -347,7 +347,7 @@
                 <w:color w:val="000000"/>
                 <w:sz w:val="19"/>
               </w:rPr>
-              <w:t>2.10 hr</w:t>
+              <w:t>2.75 hr</w:t>
             </w:r>
           </w:p>
         </w:tc>
@@ -374,7 +374,7 @@
                 <w:color w:val="000000"/>
                 <w:sz w:val="19"/>
               </w:rPr>
-              <w:t>64.6%</w:t>
+              <w:t>84.6%</w:t>
             </w:r>
           </w:p>
         </w:tc>
@@ -428,7 +428,7 @@
                 <w:color w:val="000000"/>
                 <w:sz w:val="19"/>
               </w:rPr>
-              <w:t>6.50 km</w:t>
+              <w:t>8.50 km</w:t>
             </w:r>
           </w:p>
         </w:tc>
@@ -455,7 +455,7 @@
                 <w:color w:val="000000"/>
                 <w:sz w:val="19"/>
               </w:rPr>
-              <w:t>282.6%</w:t>
+              <w:t>369.6%</w:t>
             </w:r>
           </w:p>
         </w:tc>
@@ -783,7 +783,7 @@
                 <w:color w:val="000000"/>
                 <w:sz w:val="19"/>
               </w:rPr>
-              <w:t>3.30 hr</w:t>
+              <w:t>4.80 hr</w:t>
             </w:r>
           </w:p>
         </w:tc>
@@ -810,7 +810,7 @@
                 <w:color w:val="000000"/>
                 <w:sz w:val="19"/>
               </w:rPr>
-              <w:t>72.0%</w:t>
+              <w:t>104.7%</w:t>
             </w:r>
           </w:p>
         </w:tc>
@@ -864,7 +864,7 @@
                 <w:color w:val="000000"/>
                 <w:sz w:val="19"/>
               </w:rPr>
-              <w:t>30.65 km</w:t>
+              <w:t>46.05 km</w:t>
             </w:r>
           </w:p>
         </w:tc>
@@ -891,7 +891,7 @@
                 <w:color w:val="000000"/>
                 <w:sz w:val="19"/>
               </w:rPr>
-              <w:t>65.6%</w:t>
+              <w:t>98.6%</w:t>
             </w:r>
           </w:p>
         </w:tc>
@@ -3125,7 +3125,7 @@
                 <w:color w:val="000000"/>
                 <w:sz w:val="19"/>
               </w:rPr>
-              <w:t>0分</w:t>
+              <w:t>90分 / 15.40km</w:t>
             </w:r>
           </w:p>
         </w:tc>
@@ -3152,7 +3152,7 @@
                 <w:color w:val="000000"/>
                 <w:sz w:val="19"/>
               </w:rPr>
-              <w:t>❌ 未執行/待排程</w:t>
+              <w:t>✅ 精準達標 (100%, A+)</w:t>
             </w:r>
           </w:p>
         </w:tc>
@@ -3291,7 +3291,7 @@
                 <w:color w:val="000000"/>
                 <w:sz w:val="19"/>
               </w:rPr>
-              <w:t>0分</w:t>
+              <w:t>39分 / 2.00km</w:t>
             </w:r>
           </w:p>
         </w:tc>
@@ -3318,7 +3318,7 @@
                 <w:color w:val="000000"/>
                 <w:sz w:val="19"/>
               </w:rPr>
-              <w:t>❌ 未執行/待排程</w:t>
+              <w:t>🟢 良好達標 (87%, A-)</w:t>
             </w:r>
           </w:p>
         </w:tc>
@@ -3345,7 +3345,7 @@
     </w:p>
     <w:p>
       <w:r>
-        <w:t>• 當週累積自行車 190.50 km、跑步 30.65 km、游泳 6.50 km，整體時間執行率達 82.1%。</w:t>
+        <w:t>• 當週累積自行車 190.50 km、跑步 46.05 km、游泳 8.50 km，整體時間執行率達 96.5%。</w:t>
         <w:br/>
       </w:r>
       <w:r>
@@ -3354,6 +3354,10 @@
       </w:r>
       <w:r>
         <w:t>• 順利完成 17.52 km 長跑（總爬升 +327m），平路河濱漸速至 5:26/km，上坡穩健控心率並自覺補水折返，下坡迅速拉高步頻收尾。</w:t>
+        <w:br/>
+      </w:r>
+      <w:r>
+        <w:t>• 游泳實游 4,100m，雙組 1,600m 自由式持續游繳出 1:56~1:58/100m 高度一致均速與 140 bpm 穩定心率，水感極佳。</w:t>
         <w:br/>
       </w:r>
       <w:r>

</xml_diff>